<commit_message>
force reload sidebar module on page reruns to clear cache
</commit_message>
<xml_diff>
--- a/Gyani_Baba_Project_Report.docx
+++ b/Gyani_Baba_Project_Report.docx
@@ -5711,6 +5711,8 @@
         <w:br/>
         <w:t># Render standard sidebar</w:t>
         <w:br/>
+        <w:t>importlib.reload(components.sidebar)</w:t>
+        <w:br/>
         <w:t>render_sidebar("Chat")</w:t>
         <w:br/>
         <w:br/>
@@ -6295,6 +6297,8 @@
         <w:br/>
         <w:t># Render Sidebar</w:t>
         <w:br/>
+        <w:t>importlib.reload(components.sidebar)</w:t>
+        <w:br/>
         <w:t>render_sidebar("Upload")</w:t>
         <w:br/>
         <w:br/>
@@ -6786,6 +6790,8 @@
         <w:br/>
         <w:t># Render sidebar</w:t>
         <w:br/>
+        <w:t>importlib.reload(components.sidebar)</w:t>
+        <w:br/>
         <w:t>render_sidebar("Library")</w:t>
         <w:br/>
         <w:br/>
@@ -7194,6 +7200,8 @@
         <w:br/>
         <w:br/>
         <w:t># Render sidebar</w:t>
+        <w:br/>
+        <w:t>importlib.reload(components.sidebar)</w:t>
         <w:br/>
         <w:t>render_sidebar("Settings")</w:t>
         <w:br/>

</xml_diff>